<commit_message>
Email docx: clarify Expo Go does not need to be opened, skip login
Co-Authored-By: Claude Sonnet 4.6 <noreply@anthropic.com>
</commit_message>
<xml_diff>
--- a/VSS_2026_Email.docx
+++ b/VSS_2026_Email.docx
@@ -53,7 +53,7 @@
           <w:b/>
           <w:bCs/>
         </w:rPr>
-        <w:t xml:space="preserve">To use it — no account or setup required:</w:t>
+        <w:t>To use it — no account or setup required. No need to open Expo Go — just install it, then scan the QR code with your phone's camera.</w:t>
       </w:r>
     </w:p>
     <w:p>
@@ -208,6 +208,11 @@
       </w:pPr>
       <w:r>
         <w:t xml:space="preserve">Point the camera at the QR code — the app loads immediately</w:t>
+      </w:r>
+    </w:p>
+    <w:p>
+      <w:r>
+        <w:t>No login needed: If Expo Go asks you to log in, skip it — just use your phone's camera to scan the QR code directly.</w:t>
       </w:r>
     </w:p>
     <w:p>

</xml_diff>

<commit_message>
Add web version as Option 1 in email and Word doc
Restructures the attendee instructions to lead with the no-install
web version, with home screen tips, followed by Expo Go as Option 2
for full Apple Calendar support.

Co-Authored-By: Claude Sonnet 4.6 <noreply@anthropic.com>
</commit_message>
<xml_diff>
--- a/VSS_2026_Email.docx
+++ b/VSS_2026_Email.docx
@@ -53,7 +53,136 @@
           <w:b/>
           <w:bCs/>
         </w:rPr>
-        <w:t>To use it — no account or setup required. No need to open Expo Go — just install it, then scan the QR code with your phone's camera.</w:t>
+        <w:t>Two ways to use it — choose whichever is easier:</w:t>
+      </w:r>
+    </w:p>
+    <w:p>
+      <w:r>
+        <w:rPr>
+          <w:b/>
+        </w:rPr>
+        <w:t>Option 1: Web version (simplest — no installation required)</w:t>
+      </w:r>
+    </w:p>
+    <w:p>
+      <w:r>
+        <w:rPr>
+          <w:b w:val="0"/>
+        </w:rPr>
+      </w:r>
+    </w:p>
+    <w:p>
+      <w:r>
+        <w:rPr>
+          <w:b w:val="0"/>
+        </w:rPr>
+        <w:t>Open in any phone browser: https://markwgreenlee.github.io/vss-2026-scheduler</w:t>
+      </w:r>
+    </w:p>
+    <w:p>
+      <w:r>
+        <w:rPr>
+          <w:b w:val="0"/>
+        </w:rPr>
+      </w:r>
+    </w:p>
+    <w:p>
+      <w:r>
+        <w:rPr>
+          <w:b w:val="0"/>
+        </w:rPr>
+        <w:t>Or scan the QR code in the attached guide. Works on any iPhone or Android — no app, no account, no setup. Google Calendar export is available; Apple Calendar export requires Option 2.</w:t>
+      </w:r>
+    </w:p>
+    <w:p>
+      <w:r>
+        <w:rPr>
+          <w:b w:val="0"/>
+        </w:rPr>
+      </w:r>
+    </w:p>
+    <w:p>
+      <w:r>
+        <w:rPr>
+          <w:b w:val="0"/>
+        </w:rPr>
+        <w:t>Optional — add to your home screen for quick access:</w:t>
+      </w:r>
+    </w:p>
+    <w:p>
+      <w:r>
+        <w:rPr>
+          <w:b w:val="0"/>
+        </w:rPr>
+        <w:t>iPhone (Safari): tap the Share button → Add to Home Screen</w:t>
+      </w:r>
+    </w:p>
+    <w:p>
+      <w:r>
+        <w:rPr>
+          <w:b w:val="0"/>
+        </w:rPr>
+        <w:t>iPhone (Chrome): tap the three-dot menu → Add to Home Screen</w:t>
+      </w:r>
+    </w:p>
+    <w:p>
+      <w:r>
+        <w:rPr>
+          <w:b w:val="0"/>
+        </w:rPr>
+        <w:t>Android (Chrome): tap the three-dot menu → Add to Home Screen</w:t>
+      </w:r>
+    </w:p>
+    <w:p>
+      <w:r>
+        <w:rPr>
+          <w:b w:val="0"/>
+        </w:rPr>
+      </w:r>
+    </w:p>
+    <w:p>
+      <w:r>
+        <w:rPr>
+          <w:b w:val="0"/>
+        </w:rPr>
+        <w:t>—</w:t>
+      </w:r>
+    </w:p>
+    <w:p>
+      <w:r>
+        <w:rPr>
+          <w:b w:val="0"/>
+        </w:rPr>
+      </w:r>
+    </w:p>
+    <w:p>
+      <w:r>
+        <w:rPr>
+          <w:b/>
+        </w:rPr>
+        <w:t>Option 2: Expo Go app (full features including Apple Calendar)</w:t>
+      </w:r>
+    </w:p>
+    <w:p>
+      <w:r>
+        <w:rPr>
+          <w:b w:val="0"/>
+        </w:rPr>
+      </w:r>
+    </w:p>
+    <w:p>
+      <w:r>
+        <w:rPr>
+          <w:b w:val="0"/>
+        </w:rPr>
+        <w:t>No account or setup required. No need to open Expo Go — just install it, then scan the QR code with your phone's camera.</w:t>
+      </w:r>
+    </w:p>
+    <w:p>
+      <w:r>
+        <w:rPr>
+          <w:b w:val="0"/>
+        </w:rPr>
       </w:r>
     </w:p>
     <w:p>

</xml_diff>

<commit_message>
Remove Expo Go as attendee option from email and Word doc
Expo policy change (May 12, 2026) makes Expo Go QR distribution
impossible for general audiences. Web version is now the sole method.

Co-Authored-By: Claude Sonnet 4.6 <noreply@anthropic.com>
</commit_message>
<xml_diff>
--- a/VSS_2026_Email.docx
+++ b/VSS_2026_Email.docx
@@ -53,15 +53,14 @@
           <w:b/>
           <w:bCs/>
         </w:rPr>
-        <w:t>Two ways to use it — choose whichever is easier:</w:t>
-      </w:r>
-    </w:p>
-    <w:p>
-      <w:r>
-        <w:rPr>
-          <w:b/>
-        </w:rPr>
-        <w:t>Option 1: Web version (simplest — no installation required)</w:t>
+        <w:t>No installation required — use the web version:</w:t>
+      </w:r>
+    </w:p>
+    <w:p>
+      <w:r>
+        <w:rPr>
+          <w:b w:val="0"/>
+        </w:rPr>
       </w:r>
     </w:p>
     <w:p>
@@ -91,22 +90,22 @@
         <w:rPr>
           <w:b w:val="0"/>
         </w:rPr>
-        <w:t>Or scan the QR code in the attached guide. Works on any iPhone or Android — no app, no account, no setup. Google Calendar export is available; Apple Calendar export requires Option 2.</w:t>
-      </w:r>
-    </w:p>
-    <w:p>
-      <w:r>
-        <w:rPr>
-          <w:b w:val="0"/>
-        </w:rPr>
-      </w:r>
-    </w:p>
-    <w:p>
-      <w:r>
-        <w:rPr>
-          <w:b w:val="0"/>
-        </w:rPr>
-        <w:t>Optional — add to your home screen for quick access:</w:t>
+        <w:t>Or scan the QR code in the attached guide. Works on any iPhone or Android — no app, no account, no setup. Google Calendar export included.</w:t>
+      </w:r>
+    </w:p>
+    <w:p>
+      <w:r>
+        <w:rPr>
+          <w:b w:val="0"/>
+        </w:rPr>
+      </w:r>
+    </w:p>
+    <w:p>
+      <w:r>
+        <w:rPr>
+          <w:b w:val="0"/>
+        </w:rPr>
+        <w:t>Tip: load the app before arriving at the venue so it is cached and works even on slow conference WiFi.</w:t>
       </w:r>
     </w:p>
     <w:p>
@@ -158,24 +157,22 @@
     <w:p>
       <w:r>
         <w:rPr>
-          <w:b/>
-        </w:rPr>
-        <w:t>Option 2: Expo Go app (full features including Apple Calendar)</w:t>
-      </w:r>
-    </w:p>
-    <w:p>
-      <w:r>
-        <w:rPr>
-          <w:b w:val="0"/>
-        </w:rPr>
-      </w:r>
-    </w:p>
-    <w:p>
-      <w:r>
-        <w:rPr>
-          <w:b w:val="0"/>
-        </w:rPr>
-        <w:t>No account or setup required. No need to open Expo Go — just install it, then scan the QR code with your phone's camera.</w:t>
+          <w:b w:val="0"/>
+        </w:rPr>
+      </w:r>
+    </w:p>
+    <w:p>
+      <w:r>
+        <w:rPr>
+          <w:b w:val="0"/>
+        </w:rPr>
+      </w:r>
+    </w:p>
+    <w:p>
+      <w:r>
+        <w:rPr>
+          <w:b w:val="0"/>
+        </w:rPr>
       </w:r>
     </w:p>
     <w:p>
@@ -191,10 +188,10 @@
       </w:pPr>
       <w:r>
         <w:rPr>
+          <w:b w:val="0"/>
           <w:i/>
           <w:iCs/>
         </w:rPr>
-        <w:t xml:space="preserve">iPhone:</w:t>
       </w:r>
     </w:p>
     <w:p>
@@ -206,24 +203,19 @@
         </w:numPr>
       </w:pPr>
       <w:r>
-        <w:t xml:space="preserve">Install the free</w:t>
-      </w:r>
-      <w:r>
-        <w:t xml:space="preserve"> </w:t>
-      </w:r>
+        <w:rPr>
+          <w:b w:val="0"/>
+        </w:rPr>
+      </w:r>
+      <w:r/>
       <w:r>
         <w:rPr>
           <w:b/>
           <w:bCs/>
         </w:rPr>
-        <w:t xml:space="preserve">Expo Go</w:t>
-      </w:r>
-      <w:r>
-        <w:t xml:space="preserve"> </w:t>
-      </w:r>
-      <w:r>
-        <w:t xml:space="preserve">app from the App Store</w:t>
-      </w:r>
+      </w:r>
+      <w:r/>
+      <w:r/>
     </w:p>
     <w:p>
       <w:pPr>
@@ -234,24 +226,19 @@
         </w:numPr>
       </w:pPr>
       <w:r>
-        <w:t xml:space="preserve">Open the</w:t>
-      </w:r>
-      <w:r>
-        <w:t xml:space="preserve"> </w:t>
-      </w:r>
+        <w:rPr>
+          <w:b w:val="0"/>
+        </w:rPr>
+      </w:r>
+      <w:r/>
       <w:r>
         <w:rPr>
           <w:b/>
           <w:bCs/>
         </w:rPr>
-        <w:t xml:space="preserve">Camera app</w:t>
-      </w:r>
-      <w:r>
-        <w:t xml:space="preserve"> </w:t>
-      </w:r>
-      <w:r>
-        <w:t xml:space="preserve">and point it at the QR code in the attached guide</w:t>
-      </w:r>
+      </w:r>
+      <w:r/>
+      <w:r/>
     </w:p>
     <w:p>
       <w:pPr>
@@ -262,7 +249,9 @@
         </w:numPr>
       </w:pPr>
       <w:r>
-        <w:t xml:space="preserve">Tap the notification that appears — it opens the app in Expo Go automatically</w:t>
+        <w:rPr>
+          <w:b w:val="0"/>
+        </w:rPr>
       </w:r>
     </w:p>
     <w:p>
@@ -271,10 +260,10 @@
       </w:pPr>
       <w:r>
         <w:rPr>
+          <w:b w:val="0"/>
           <w:i/>
           <w:iCs/>
         </w:rPr>
-        <w:t xml:space="preserve">Android:</w:t>
       </w:r>
     </w:p>
     <w:p>
@@ -286,24 +275,19 @@
         </w:numPr>
       </w:pPr>
       <w:r>
-        <w:t xml:space="preserve">Install the free</w:t>
-      </w:r>
-      <w:r>
-        <w:t xml:space="preserve"> </w:t>
-      </w:r>
+        <w:rPr>
+          <w:b w:val="0"/>
+        </w:rPr>
+      </w:r>
+      <w:r/>
       <w:r>
         <w:rPr>
           <w:b/>
           <w:bCs/>
         </w:rPr>
-        <w:t xml:space="preserve">Expo Go</w:t>
-      </w:r>
-      <w:r>
-        <w:t xml:space="preserve"> </w:t>
-      </w:r>
-      <w:r>
-        <w:t xml:space="preserve">app from the Google Play Store</w:t>
-      </w:r>
+      </w:r>
+      <w:r/>
+      <w:r/>
     </w:p>
     <w:p>
       <w:pPr>
@@ -314,17 +298,16 @@
         </w:numPr>
       </w:pPr>
       <w:r>
-        <w:t xml:space="preserve">Open Expo Go and tap</w:t>
-      </w:r>
-      <w:r>
-        <w:t xml:space="preserve"> </w:t>
-      </w:r>
+        <w:rPr>
+          <w:b w:val="0"/>
+        </w:rPr>
+      </w:r>
+      <w:r/>
       <w:r>
         <w:rPr>
           <w:b/>
           <w:bCs/>
         </w:rPr>
-        <w:t xml:space="preserve">Scan QR Code</w:t>
       </w:r>
     </w:p>
     <w:p>
@@ -336,12 +319,16 @@
         </w:numPr>
       </w:pPr>
       <w:r>
-        <w:t xml:space="preserve">Point the camera at the QR code — the app loads immediately</w:t>
-      </w:r>
-    </w:p>
-    <w:p>
-      <w:r>
-        <w:t>No login needed: If Expo Go asks you to log in, skip it — just use your phone's camera to scan the QR code directly.</w:t>
+        <w:rPr>
+          <w:b w:val="0"/>
+        </w:rPr>
+      </w:r>
+    </w:p>
+    <w:p>
+      <w:r>
+        <w:rPr>
+          <w:b w:val="0"/>
+        </w:rPr>
       </w:r>
     </w:p>
     <w:p>

</xml_diff>

<commit_message>
Restore Expo Go as alternative option with sign-out instructions
Expo Go still works in anonymous mode (not signed in). Added note
explaining that signing out restores access, across README, email,
and both Word docs.

Co-Authored-By: Claude Sonnet 4.6 <noreply@anthropic.com>
</commit_message>
<xml_diff>
--- a/VSS_2026_Email.docx
+++ b/VSS_2026_Email.docx
@@ -147,6 +147,49 @@
         <w:t>—</w:t>
       </w:r>
     </w:p>
+    <w:p>
+      <w:r>
+        <w:rPr>
+          <w:b/>
+        </w:rPr>
+        <w:t>Alternative — Expo Go app (Apple Calendar support):</w:t>
+      </w:r>
+    </w:p>
+    <w:p/>
+    <w:p>
+      <w:r>
+        <w:rPr>
+          <w:b w:val="0"/>
+        </w:rPr>
+        <w:t>If you already have Expo Go installed, you can still use the app for direct Apple Calendar export:</w:t>
+      </w:r>
+    </w:p>
+    <w:p>
+      <w:r>
+        <w:rPr>
+          <w:b w:val="0"/>
+        </w:rPr>
+        <w:t>Not signed into Expo Go: scan the QR code in the attached guide — it works directly.</w:t>
+      </w:r>
+    </w:p>
+    <w:p>
+      <w:r>
+        <w:rPr>
+          <w:b w:val="0"/>
+        </w:rPr>
+        <w:t>Signed into Expo Go: tap your profile icon → Sign out, then scan the QR code.</w:t>
+      </w:r>
+    </w:p>
+    <w:p/>
+    <w:p>
+      <w:r>
+        <w:rPr>
+          <w:b w:val="0"/>
+        </w:rPr>
+        <w:t>Note: as of May 12, 2026, Expo Go only loads projects owned by the signed-in user. Signing out returns it to anonymous mode, which works fine.</w:t>
+      </w:r>
+    </w:p>
+    <w:p/>
     <w:p>
       <w:r>
         <w:rPr>

</xml_diff>

<commit_message>
Correct Expo Go instructions: sign IN required, not sign out
Testing confirmed that signing INTO Expo Go (any free account) makes
the app work. Signing out causes the 403 error. Updated README, email,
and both Word docs accordingly.

Co-Authored-By: Claude Sonnet 4.6 <noreply@anthropic.com>
</commit_message>
<xml_diff>
--- a/VSS_2026_Email.docx
+++ b/VSS_2026_Email.docx
@@ -169,24 +169,31 @@
         <w:rPr>
           <w:b w:val="0"/>
         </w:rPr>
-        <w:t>Not signed into Expo Go: scan the QR code in the attached guide — it works directly.</w:t>
-      </w:r>
-    </w:p>
-    <w:p>
-      <w:r>
-        <w:rPr>
-          <w:b w:val="0"/>
-        </w:rPr>
-        <w:t>Signed into Expo Go: tap your profile icon → Sign out, then scan the QR code.</w:t>
-      </w:r>
-    </w:p>
-    <w:p/>
-    <w:p>
-      <w:r>
-        <w:rPr>
-          <w:b w:val="0"/>
-        </w:rPr>
-        <w:t>Note: as of May 12, 2026, Expo Go only loads projects owned by the signed-in user. Signing out returns it to anonymous mode, which works fine.</w:t>
+        <w:t>If you want direct Apple Calendar export, use Expo Go — but you must be signed in with a free Expo account:</w:t>
+      </w:r>
+    </w:p>
+    <w:p>
+      <w:r>
+        <w:rPr>
+          <w:b w:val="0"/>
+        </w:rPr>
+        <w:t>1. Create a free account at https://expo.dev if you don't have one</w:t>
+      </w:r>
+    </w:p>
+    <w:p>
+      <w:r>
+        <w:rPr>
+          <w:b w:val="0"/>
+        </w:rPr>
+        <w:t>2. Sign into Expo Go with your Expo account</w:t>
+      </w:r>
+    </w:p>
+    <w:p>
+      <w:r>
+        <w:rPr>
+          <w:b w:val="0"/>
+        </w:rPr>
+        <w:t>3. Scan the Expo Go QR code in the attached guide — the app opens automatically</w:t>
       </w:r>
     </w:p>
     <w:p/>

</xml_diff>

<commit_message>
Update all docs: any free Expo account grants Expo Go access
Confirmed by two users (iOS and Android) that signing into Expo Go
with any free account works. Updated README, email, Word docs, and
PDF with clear sign-up instructions.

Co-Authored-By: Claude Sonnet 4.6 <noreply@anthropic.com>
</commit_message>
<xml_diff>
--- a/VSS_2026_Email.docx
+++ b/VSS_2026_Email.docx
@@ -161,39 +161,39 @@
         <w:rPr>
           <w:b w:val="0"/>
         </w:rPr>
-        <w:t>If you already have Expo Go installed, you can still use the app for direct Apple Calendar export:</w:t>
-      </w:r>
-    </w:p>
-    <w:p>
-      <w:r>
-        <w:rPr>
-          <w:b w:val="0"/>
-        </w:rPr>
-        <w:t>If you want direct Apple Calendar export, use Expo Go — but you must be signed in with a free Expo account:</w:t>
-      </w:r>
-    </w:p>
-    <w:p>
-      <w:r>
-        <w:rPr>
-          <w:b w:val="0"/>
-        </w:rPr>
-        <w:t>1. Create a free account at https://expo.dev if you don't have one</w:t>
-      </w:r>
-    </w:p>
-    <w:p>
-      <w:r>
-        <w:rPr>
-          <w:b w:val="0"/>
-        </w:rPr>
-        <w:t>2. Sign into Expo Go with your Expo account</w:t>
-      </w:r>
-    </w:p>
-    <w:p>
-      <w:r>
-        <w:rPr>
-          <w:b w:val="0"/>
-        </w:rPr>
-        <w:t>3. Scan the Expo Go QR code in the attached guide — the app opens automatically</w:t>
+        <w:t>If you want direct Apple Calendar export, use Expo Go. A free Expo account is required (one-time setup):</w:t>
+      </w:r>
+    </w:p>
+    <w:p>
+      <w:r>
+        <w:rPr>
+          <w:b w:val="0"/>
+        </w:rPr>
+        <w:t>1. Install the free Expo Go app from the App Store or Google Play Store</w:t>
+      </w:r>
+    </w:p>
+    <w:p>
+      <w:r>
+        <w:rPr>
+          <w:b w:val="0"/>
+        </w:rPr>
+        <w:t>2. Open Expo Go, tap Log in → Sign up to create a free account (Google, Apple, or email)</w:t>
+      </w:r>
+    </w:p>
+    <w:p>
+      <w:r>
+        <w:rPr>
+          <w:b w:val="0"/>
+        </w:rPr>
+        <w:t>3. Once signed in, scan the Expo Go QR code in the attached guide with your Camera app</w:t>
+      </w:r>
+    </w:p>
+    <w:p>
+      <w:r>
+        <w:rPr>
+          <w:b w:val="0"/>
+        </w:rPr>
+        <w:t>4. Tap the notification — the app opens automatically. Returning users just scan the QR code.</w:t>
       </w:r>
     </w:p>
     <w:p/>

</xml_diff>